<commit_message>
updated student declaration form
</commit_message>
<xml_diff>
--- a/share/SIH26-A0H-T141_Student_Declaration.docx
+++ b/share/SIH26-A0H-T141_Student_Declaration.docx
@@ -575,25 +575,7 @@
                 <w:sz w:val="20"/>
                 <w:szCs w:val="20"/>
               </w:rPr>
-              <w:t xml:space="preserve">A </w:t>
-            </w:r>
-            <w:proofErr w:type="spellStart"/>
-            <w:r>
-              <w:rPr>
-                <w:rFonts w:cstheme="minorHAnsi"/>
-                <w:sz w:val="20"/>
-                <w:szCs w:val="20"/>
-              </w:rPr>
-              <w:t>Pardhav</w:t>
-            </w:r>
-            <w:proofErr w:type="spellEnd"/>
-            <w:r>
-              <w:rPr>
-                <w:rFonts w:cstheme="minorHAnsi"/>
-                <w:sz w:val="20"/>
-                <w:szCs w:val="20"/>
-              </w:rPr>
-              <w:t xml:space="preserve"> Reddy</w:t>
+              <w:t>A Pardhav Reddy</w:t>
             </w:r>
           </w:p>
         </w:tc>
@@ -1296,7 +1278,23 @@
                 <w:sz w:val="20"/>
                 <w:szCs w:val="20"/>
               </w:rPr>
-              <w:t>7981126685</w:t>
+              <w:t>79811</w:t>
+            </w:r>
+            <w:r>
+              <w:rPr>
+                <w:rFonts w:cstheme="minorHAnsi"/>
+                <w:sz w:val="20"/>
+                <w:szCs w:val="20"/>
+              </w:rPr>
+              <w:t>3</w:t>
+            </w:r>
+            <w:r>
+              <w:rPr>
+                <w:rFonts w:cstheme="minorHAnsi"/>
+                <w:sz w:val="20"/>
+                <w:szCs w:val="20"/>
+              </w:rPr>
+              <w:t>6685</w:t>
             </w:r>
           </w:p>
         </w:tc>
@@ -1399,23 +1397,13 @@
                 <w:szCs w:val="20"/>
               </w:rPr>
             </w:pPr>
-            <w:proofErr w:type="spellStart"/>
-            <w:r>
-              <w:rPr>
-                <w:rFonts w:cstheme="minorHAnsi"/>
-                <w:sz w:val="20"/>
-                <w:szCs w:val="20"/>
-              </w:rPr>
-              <w:t>Poovya</w:t>
-            </w:r>
-            <w:proofErr w:type="spellEnd"/>
-            <w:r>
-              <w:rPr>
-                <w:rFonts w:cstheme="minorHAnsi"/>
-                <w:sz w:val="20"/>
-                <w:szCs w:val="20"/>
-              </w:rPr>
-              <w:t xml:space="preserve"> S</w:t>
+            <w:r>
+              <w:rPr>
+                <w:rFonts w:cstheme="minorHAnsi"/>
+                <w:sz w:val="20"/>
+                <w:szCs w:val="20"/>
+              </w:rPr>
+              <w:t>Poovya S</w:t>
             </w:r>
           </w:p>
         </w:tc>
@@ -1881,29 +1869,7 @@
           <w:sz w:val="24"/>
           <w:szCs w:val="24"/>
         </w:rPr>
-        <w:t xml:space="preserve">Dr. </w:t>
-      </w:r>
-      <w:proofErr w:type="spellStart"/>
-      <w:r>
-        <w:rPr>
-          <w:rFonts w:cstheme="minorHAnsi"/>
-          <w:b/>
-          <w:bCs/>
-          <w:sz w:val="24"/>
-          <w:szCs w:val="24"/>
-        </w:rPr>
-        <w:t>Sasangan</w:t>
-      </w:r>
-      <w:proofErr w:type="spellEnd"/>
-      <w:r>
-        <w:rPr>
-          <w:rFonts w:cstheme="minorHAnsi"/>
-          <w:b/>
-          <w:bCs/>
-          <w:sz w:val="24"/>
-          <w:szCs w:val="24"/>
-        </w:rPr>
-        <w:t xml:space="preserve"> Ramanathan</w:t>
+        <w:t>Dr. Sasangan Ramanathan</w:t>
       </w:r>
     </w:p>
     <w:p>
@@ -1947,20 +1913,8 @@
           <w:sz w:val="24"/>
           <w:szCs w:val="24"/>
         </w:rPr>
-        <w:t xml:space="preserve">Amrita Vishwa Vidyapeetham, </w:t>
+        <w:t>Amrita Vishwa Vidyapeetham, Coimbatore .</w:t>
       </w:r>
-      <w:proofErr w:type="gramStart"/>
-      <w:r>
-        <w:rPr>
-          <w:rFonts w:cstheme="minorHAnsi"/>
-          <w:i/>
-          <w:iCs/>
-          <w:sz w:val="24"/>
-          <w:szCs w:val="24"/>
-        </w:rPr>
-        <w:t>Coimbatore .</w:t>
-      </w:r>
-      <w:proofErr w:type="gramEnd"/>
     </w:p>
     <w:p>
       <w:pPr>

</xml_diff>